<commit_message>
Close out the post-merge review: 34 findings applied
The benchmark files now verify against their manifest on this machine, fixed
by extending the .gitattributes byte-exactness rule to data/benchmarks and
re-checking out. The evaluation-corpus contract gains its NarrativeQA row,
loses the contradictory BookCoref rejection, and agrees with every other file
on where LongMemEval sits. The measurement slate, the proposal's commitments,
and the fixtures now say the same things: OCR and translation taxes are
measured, the MemTree cost comparison is committed, and the cells ablation is
committed with resolution as the candidate second. Dead cross-references from
the merge are repointed, the stale superseded banners on the related-work
drafts are gone, and the cost figures compute: $2.30 to $335 is the 146-fold
spread, 879 to 331,375 tokens is the 377-fold one.

Co-Authored-By: Claude Opus 5 <noreply@anthropic.com>
</commit_message>
<xml_diff>
--- a/build/IT494_Proposal.docx
+++ b/build/IT494_Proposal.docx
@@ -79,7 +79,7 @@
     </w:p>
     <w:p>
       <w:r>
-        <w:t>Four public-domain corpora are already assembled, 81 files and about 6.8 million words: the Oz canon, the complete Sherlock Holmes, the major Greek mythological sources, and the Chinese classical novels. Oz supplies the supersession fixture and a mid-canon change of author. Holmes contributes a contradiction Doyle never reconciled and a contamination probe: the deerstalker cap belongs to the illustrations, not the text, so if an induced description of Holmes contains one, the description came from the model's training and not from my store. The Greek corpus supplies irreconcilable disagreement between sources and hundreds of free entity-resolution test pairs, since Ovid names in Latin what Homer names in Greek. The Chinese corpus holds the same novel as proofread text, raw OCR, and machine translation, which lets me measure what OCR error and translation error each cost the pipeline.</w:t>
+        <w:t>Four public-domain corpora are already assembled, 81 files and about 6.9 million words: the Oz canon, the complete Sherlock Holmes, the major Greek mythological sources, and the Chinese classical novels. Oz supplies the supersession fixture and a mid-canon change of author. Holmes contributes a contradiction Doyle never reconciled and a contamination probe: the deerstalker cap belongs to the illustrations, not the text, so if an induced description of Holmes contains one, the description came from the model's training and not from my store. The Greek corpus supplies irreconcilable disagreement between sources and hundreds of free entity-resolution test pairs, since Ovid names in Latin what Homer names in Greek. The Chinese corpus holds the same novel as proofread text, raw OCR, and machine translation, which lets me measure what OCR error and translation error each cost the pipeline.</w:t>
       </w:r>
     </w:p>
     <w:p>
@@ -123,7 +123,7 @@
     </w:p>
     <w:p>
       <w:r>
-        <w:t>Second, resolution accuracy against a hand-labelled alias set over one novel, built in the first week and scored from the very first ingest.</w:t>
+        <w:t>Second, resolution accuracy against a hand-labeled alias set over one novel, built in the first week and scored from the very first ingest.</w:t>
       </w:r>
     </w:p>
     <w:p>
@@ -133,7 +133,7 @@
     </w:p>
     <w:p>
       <w:r>
-        <w:t>Fourth, the instruments that fall out of running the pipeline at all: duplicate entities minted per chapter, the rate at which extracted quotes fail to appear verbatim in their source, predicate sprawl, token cost per stage and per model tier, and agreement between the chapter-level and entity-level summaries, which describe the same text independently and catch each other's omissions.</w:t>
+        <w:t>Fourth, the instruments that fall out of running the pipeline at all: duplicate entities minted per chapter, the rate at which extracted quotes fail to appear verbatim in their source, predicate sprawl, token cost per stage and per model tier, agreement between the chapter-level and entity-level summaries, which describe the same text independently and catch each other's omissions, and the cost of keeping summaries current as the corpus grows, set against published figures for full-rebuild systems.</w:t>
       </w:r>
     </w:p>
     <w:p>
@@ -182,7 +182,7 @@
     </w:p>
     <w:p>
       <w:r>
-        <w:t>Hours, not compute, are the binding constraint. The full four-corpus run costs from a few dollars on the cheapest model tier to a few hundred on the priciest at batch rates. When something slips, the plan cuts corpus scope, never measurement.</w:t>
+        <w:t>Hours are the binding constraint; the compute is a few dollars to a few hundred at batch rates for the full four-corpus run. When something slips, I cut corpus scope and keep every committed measurement.</w:t>
       </w:r>
     </w:p>
     <w:sectPr>

</xml_diff>

<commit_message>
Five review findings applied before anything is built against them
The hours table is back and the slate is priced against it, 74 to 127 hours
against roughly 64, with the cut order decided now and a protected core named.
The resolution ablation takes the committed slot, since it is the measurement
the position claims and the logged per-signal scores make it a replay; cells
moves to next-in-line. GraphRAG-Bench gets the same parity discipline as
LongMemEval: reproduce their plain-RAG baseline first or report cost as
ratios. Supersession scores now carry their denominator, the functional list
and the fraction of questions touching it. And the ordering rule is settled
for mixed corpora: an undated fact never supersedes a dated one; that
collision is flagged, not resolved.

Co-Authored-By: Claude Opus 5 <noreply@anthropic.com>
</commit_message>
<xml_diff>
--- a/build/IT494_Proposal.docx
+++ b/build/IT494_Proposal.docx
@@ -221,7 +221,7 @@
         <w:rPr>
           <w:sz w:val="22"/>
         </w:rPr>
-        <w:t>First, question answering on GraphRAG-Bench, a benchmark of 2,010 questions with gold answers and gold evidence over twenty pre-1900 novels, where nine systems have published numbers under the same reader model. I run the full system, a no-context control, and flat retrieval, then once more with the per-entity narratives switched off. Their own results give the target: the best system spends about a thousand tokens per question and the most expensive spends over three hundred thousand, so accuracy per token is where a serverless design can show up.</w:t>
+        <w:t>First, question answering on GraphRAG-Bench, a benchmark of 2,010 questions with gold answers and gold evidence over twenty pre-1900 novels, where nine systems have published numbers under the same reader model. I run the full system, a no-context control, and flat retrieval, then once more with the co-occurrence and profile resolution signals switched off, which isolates what my one open question is worth. The per-entity narrative ablation runs after it if hours allow. Their own results give the target: the best system spends about a thousand tokens per question and the most expensive spends over three hundred thousand, so accuracy per token is where a serverless design can show up.</w:t>
       </w:r>
     </w:p>
     <w:p>
@@ -345,7 +345,7 @@
         <w:rPr>
           <w:sz w:val="22"/>
         </w:rPr>
-        <w:t>Hours are the binding constraint; the compute is a few dollars to a few hundred at batch rates for the full four-corpus run. When something slips, I cut corpus scope and keep every committed measurement.</w:t>
+        <w:t>Hours are the binding constraint; the compute is a few dollars to a few hundred at batch rates for the full four-corpus run. The plan in the repository prices every slate item against the open weeks and carries a cut order decided now rather than in November. When something slips, I cut from the bottom of that order and keep the committed measurements.</w:t>
       </w:r>
     </w:p>
     <w:p>
@@ -1240,7 +1240,626 @@
         <w:rPr>
           <w:sz w:val="22"/>
         </w:rPr>
-        <w:t>Hours are the scarce resource, and the author writes the code; AI drafts and argues but ships nothing unexamined. When something slips, corpus scope gets cut and every measurement stays.</w:t>
+        <w:t>Hours are the scarce resource, and the author writes the code; AI drafts and argues but ships nothing unexamined.</w:t>
+      </w:r>
+    </w:p>
+    <w:p>
+      <w:pPr>
+        <w:spacing w:before="320" w:after="100"/>
+        <w:jc w:val="left"/>
+      </w:pPr>
+      <w:r>
+        <w:rPr>
+          <w:b/>
+          <w:color w:val="1F3864"/>
+          <w:sz w:val="30"/>
+        </w:rPr>
+        <w:t>The bill, priced now</w:t>
+      </w:r>
+    </w:p>
+    <w:p>
+      <w:pPr>
+        <w:jc w:val="both"/>
+      </w:pPr>
+      <w:r>
+        <w:rPr>
+          <w:sz w:val="22"/>
+        </w:rPr>
+        <w:t>The two open blocks hold roughly 64 hours at eight a week, and the 8-hours-a-week assumption is itself unverified against a real week. The slate, priced:</w:t>
+      </w:r>
+    </w:p>
+    <w:tbl>
+      <w:tblPr>
+        <w:tblStyle w:val="TableGrid"/>
+        <w:tblW w:type="auto" w:w="0"/>
+        <w:jc w:val="left"/>
+        <w:tblLook w:firstColumn="1" w:firstRow="1" w:lastColumn="0" w:lastRow="0" w:noHBand="0" w:noVBand="1" w:val="04A0"/>
+      </w:tblPr>
+      <w:tblGrid>
+        <w:gridCol w:w="4680"/>
+        <w:gridCol w:w="4680"/>
+      </w:tblGrid>
+      <w:tr>
+        <w:tc>
+          <w:tcPr>
+            <w:tcW w:type="dxa" w:w="4680"/>
+          </w:tcPr>
+          <w:p>
+            <w:pPr>
+              <w:spacing w:after="40"/>
+            </w:pPr>
+            <w:r>
+              <w:rPr>
+                <w:b/>
+                <w:sz w:val="18"/>
+              </w:rPr>
+              <w:t>Work</w:t>
+            </w:r>
+          </w:p>
+        </w:tc>
+        <w:tc>
+          <w:tcPr>
+            <w:tcW w:type="dxa" w:w="4680"/>
+          </w:tcPr>
+          <w:p>
+            <w:pPr>
+              <w:spacing w:after="40"/>
+            </w:pPr>
+            <w:r>
+              <w:rPr>
+                <w:b/>
+                <w:sz w:val="18"/>
+              </w:rPr>
+              <w:t>Hours</w:t>
+            </w:r>
+          </w:p>
+        </w:tc>
+      </w:tr>
+      <w:tr>
+        <w:tc>
+          <w:tcPr>
+            <w:tcW w:type="dxa" w:w="4680"/>
+          </w:tcPr>
+          <w:p>
+            <w:pPr>
+              <w:spacing w:after="40"/>
+            </w:pPr>
+            <w:r>
+              <w:rPr>
+                <w:sz w:val="18"/>
+              </w:rPr>
+              <w:t>Splitting, gates, dataset publish</w:t>
+            </w:r>
+          </w:p>
+        </w:tc>
+        <w:tc>
+          <w:tcPr>
+            <w:tcW w:type="dxa" w:w="4680"/>
+          </w:tcPr>
+          <w:p>
+            <w:pPr>
+              <w:spacing w:after="40"/>
+            </w:pPr>
+            <w:r>
+              <w:rPr>
+                <w:sz w:val="18"/>
+              </w:rPr>
+              <w:t>8-12</w:t>
+            </w:r>
+          </w:p>
+        </w:tc>
+      </w:tr>
+      <w:tr>
+        <w:tc>
+          <w:tcPr>
+            <w:tcW w:type="dxa" w:w="4680"/>
+          </w:tcPr>
+          <w:p>
+            <w:pPr>
+              <w:spacing w:after="40"/>
+            </w:pPr>
+            <w:r>
+              <w:rPr>
+                <w:sz w:val="18"/>
+              </w:rPr>
+              <w:t>Store, ingest, organize, maintain</w:t>
+            </w:r>
+          </w:p>
+        </w:tc>
+        <w:tc>
+          <w:tcPr>
+            <w:tcW w:type="dxa" w:w="4680"/>
+          </w:tcPr>
+          <w:p>
+            <w:pPr>
+              <w:spacing w:after="40"/>
+            </w:pPr>
+            <w:r>
+              <w:rPr>
+                <w:sz w:val="18"/>
+              </w:rPr>
+              <w:t>20-40</w:t>
+            </w:r>
+          </w:p>
+        </w:tc>
+      </w:tr>
+      <w:tr>
+        <w:tc>
+          <w:tcPr>
+            <w:tcW w:type="dxa" w:w="4680"/>
+          </w:tcPr>
+          <w:p>
+            <w:pPr>
+              <w:spacing w:after="40"/>
+            </w:pPr>
+            <w:r>
+              <w:rPr>
+                <w:sz w:val="18"/>
+              </w:rPr>
+              <w:t>Hand-labeled alias set</w:t>
+            </w:r>
+          </w:p>
+        </w:tc>
+        <w:tc>
+          <w:tcPr>
+            <w:tcW w:type="dxa" w:w="4680"/>
+          </w:tcPr>
+          <w:p>
+            <w:pPr>
+              <w:spacing w:after="40"/>
+            </w:pPr>
+            <w:r>
+              <w:rPr>
+                <w:sz w:val="18"/>
+              </w:rPr>
+              <w:t>1</w:t>
+            </w:r>
+          </w:p>
+        </w:tc>
+      </w:tr>
+      <w:tr>
+        <w:tc>
+          <w:tcPr>
+            <w:tcW w:type="dxa" w:w="4680"/>
+          </w:tcPr>
+          <w:p>
+            <w:pPr>
+              <w:spacing w:after="40"/>
+            </w:pPr>
+            <w:r>
+              <w:rPr>
+                <w:sz w:val="18"/>
+              </w:rPr>
+              <w:t>GraphRAG-Bench: three arms, scorer wiring, plain-RAG parity check</w:t>
+            </w:r>
+          </w:p>
+        </w:tc>
+        <w:tc>
+          <w:tcPr>
+            <w:tcW w:type="dxa" w:w="4680"/>
+          </w:tcPr>
+          <w:p>
+            <w:pPr>
+              <w:spacing w:after="40"/>
+            </w:pPr>
+            <w:r>
+              <w:rPr>
+                <w:sz w:val="18"/>
+              </w:rPr>
+              <w:t>8-12</w:t>
+            </w:r>
+          </w:p>
+        </w:tc>
+      </w:tr>
+      <w:tr>
+        <w:tc>
+          <w:tcPr>
+            <w:tcW w:type="dxa" w:w="4680"/>
+          </w:tcPr>
+          <w:p>
+            <w:pPr>
+              <w:spacing w:after="40"/>
+            </w:pPr>
+            <w:r>
+              <w:rPr>
+                <w:sz w:val="18"/>
+              </w:rPr>
+              <w:t>Resolution ablation, replayed from logged scores</w:t>
+            </w:r>
+          </w:p>
+        </w:tc>
+        <w:tc>
+          <w:tcPr>
+            <w:tcW w:type="dxa" w:w="4680"/>
+          </w:tcPr>
+          <w:p>
+            <w:pPr>
+              <w:spacing w:after="40"/>
+            </w:pPr>
+            <w:r>
+              <w:rPr>
+                <w:sz w:val="18"/>
+              </w:rPr>
+              <w:t>2-3</w:t>
+            </w:r>
+          </w:p>
+        </w:tc>
+      </w:tr>
+      <w:tr>
+        <w:tc>
+          <w:tcPr>
+            <w:tcW w:type="dxa" w:w="4680"/>
+          </w:tcPr>
+          <w:p>
+            <w:pPr>
+              <w:spacing w:after="40"/>
+            </w:pPr>
+            <w:r>
+              <w:rPr>
+                <w:sz w:val="18"/>
+              </w:rPr>
+              <w:t>Cost curves: read, refold, coverage</w:t>
+            </w:r>
+          </w:p>
+        </w:tc>
+        <w:tc>
+          <w:tcPr>
+            <w:tcW w:type="dxa" w:w="4680"/>
+          </w:tcPr>
+          <w:p>
+            <w:pPr>
+              <w:spacing w:after="40"/>
+            </w:pPr>
+            <w:r>
+              <w:rPr>
+                <w:sz w:val="18"/>
+              </w:rPr>
+              <w:t>3-5</w:t>
+            </w:r>
+          </w:p>
+        </w:tc>
+      </w:tr>
+      <w:tr>
+        <w:tc>
+          <w:tcPr>
+            <w:tcW w:type="dxa" w:w="4680"/>
+          </w:tcPr>
+          <w:p>
+            <w:pPr>
+              <w:spacing w:after="40"/>
+            </w:pPr>
+            <w:r>
+              <w:rPr>
+                <w:sz w:val="18"/>
+              </w:rPr>
+              <w:t>OCR control</w:t>
+            </w:r>
+          </w:p>
+        </w:tc>
+        <w:tc>
+          <w:tcPr>
+            <w:tcW w:type="dxa" w:w="4680"/>
+          </w:tcPr>
+          <w:p>
+            <w:pPr>
+              <w:spacing w:after="40"/>
+            </w:pPr>
+            <w:r>
+              <w:rPr>
+                <w:sz w:val="18"/>
+              </w:rPr>
+              <w:t>2-3</w:t>
+            </w:r>
+          </w:p>
+        </w:tc>
+      </w:tr>
+      <w:tr>
+        <w:tc>
+          <w:tcPr>
+            <w:tcW w:type="dxa" w:w="4680"/>
+          </w:tcPr>
+          <w:p>
+            <w:pPr>
+              <w:spacing w:after="40"/>
+            </w:pPr>
+            <w:r>
+              <w:rPr>
+                <w:sz w:val="18"/>
+              </w:rPr>
+              <w:t>Translation control, including the machine translation run</w:t>
+            </w:r>
+          </w:p>
+        </w:tc>
+        <w:tc>
+          <w:tcPr>
+            <w:tcW w:type="dxa" w:w="4680"/>
+          </w:tcPr>
+          <w:p>
+            <w:pPr>
+              <w:spacing w:after="40"/>
+            </w:pPr>
+            <w:r>
+              <w:rPr>
+                <w:sz w:val="18"/>
+              </w:rPr>
+              <w:t>3-6</w:t>
+            </w:r>
+          </w:p>
+        </w:tc>
+      </w:tr>
+      <w:tr>
+        <w:tc>
+          <w:tcPr>
+            <w:tcW w:type="dxa" w:w="4680"/>
+          </w:tcPr>
+          <w:p>
+            <w:pPr>
+              <w:spacing w:after="40"/>
+            </w:pPr>
+            <w:r>
+              <w:rPr>
+                <w:sz w:val="18"/>
+              </w:rPr>
+              <w:t>NarrativeQA evaluator and arms</w:t>
+            </w:r>
+          </w:p>
+        </w:tc>
+        <w:tc>
+          <w:tcPr>
+            <w:tcW w:type="dxa" w:w="4680"/>
+          </w:tcPr>
+          <w:p>
+            <w:pPr>
+              <w:spacing w:after="40"/>
+            </w:pPr>
+            <w:r>
+              <w:rPr>
+                <w:sz w:val="18"/>
+              </w:rPr>
+              <w:t>3-5</w:t>
+            </w:r>
+          </w:p>
+        </w:tc>
+      </w:tr>
+      <w:tr>
+        <w:tc>
+          <w:tcPr>
+            <w:tcW w:type="dxa" w:w="4680"/>
+          </w:tcPr>
+          <w:p>
+            <w:pPr>
+              <w:spacing w:after="40"/>
+            </w:pPr>
+            <w:r>
+              <w:rPr>
+                <w:sz w:val="18"/>
+              </w:rPr>
+              <w:t>Wiki: the Tip and Ozma page, the Holmes page, the ship checks</w:t>
+            </w:r>
+          </w:p>
+        </w:tc>
+        <w:tc>
+          <w:tcPr>
+            <w:tcW w:type="dxa" w:w="4680"/>
+          </w:tcPr>
+          <w:p>
+            <w:pPr>
+              <w:spacing w:after="40"/>
+            </w:pPr>
+            <w:r>
+              <w:rPr>
+                <w:sz w:val="18"/>
+              </w:rPr>
+              <w:t>4-8</w:t>
+            </w:r>
+          </w:p>
+        </w:tc>
+      </w:tr>
+      <w:tr>
+        <w:tc>
+          <w:tcPr>
+            <w:tcW w:type="dxa" w:w="4680"/>
+          </w:tcPr>
+          <w:p>
+            <w:pPr>
+              <w:spacing w:after="40"/>
+            </w:pPr>
+            <w:r>
+              <w:rPr>
+                <w:sz w:val="18"/>
+              </w:rPr>
+              <w:t>Cells ablation</w:t>
+            </w:r>
+          </w:p>
+        </w:tc>
+        <w:tc>
+          <w:tcPr>
+            <w:tcW w:type="dxa" w:w="4680"/>
+          </w:tcPr>
+          <w:p>
+            <w:pPr>
+              <w:spacing w:after="40"/>
+            </w:pPr>
+            <w:r>
+              <w:rPr>
+                <w:sz w:val="18"/>
+              </w:rPr>
+              <w:t>2</w:t>
+            </w:r>
+          </w:p>
+        </w:tc>
+      </w:tr>
+      <w:tr>
+        <w:tc>
+          <w:tcPr>
+            <w:tcW w:type="dxa" w:w="4680"/>
+          </w:tcPr>
+          <w:p>
+            <w:pPr>
+              <w:spacing w:after="40"/>
+            </w:pPr>
+            <w:r>
+              <w:rPr>
+                <w:sz w:val="18"/>
+              </w:rPr>
+              <w:t>LongMemEval loader, parity arm, update band</w:t>
+            </w:r>
+          </w:p>
+        </w:tc>
+        <w:tc>
+          <w:tcPr>
+            <w:tcW w:type="dxa" w:w="4680"/>
+          </w:tcPr>
+          <w:p>
+            <w:pPr>
+              <w:spacing w:after="40"/>
+            </w:pPr>
+            <w:r>
+              <w:rPr>
+                <w:sz w:val="18"/>
+              </w:rPr>
+              <w:t>8-15</w:t>
+            </w:r>
+          </w:p>
+        </w:tc>
+      </w:tr>
+      <w:tr>
+        <w:tc>
+          <w:tcPr>
+            <w:tcW w:type="dxa" w:w="4680"/>
+          </w:tcPr>
+          <w:p>
+            <w:pPr>
+              <w:spacing w:after="40"/>
+            </w:pPr>
+            <w:r>
+              <w:rPr>
+                <w:sz w:val="18"/>
+              </w:rPr>
+              <w:t>Paper writing</w:t>
+            </w:r>
+          </w:p>
+        </w:tc>
+        <w:tc>
+          <w:tcPr>
+            <w:tcW w:type="dxa" w:w="4680"/>
+          </w:tcPr>
+          <w:p>
+            <w:pPr>
+              <w:spacing w:after="40"/>
+            </w:pPr>
+            <w:r>
+              <w:rPr>
+                <w:sz w:val="18"/>
+              </w:rPr>
+              <w:t>10-15</w:t>
+            </w:r>
+          </w:p>
+        </w:tc>
+      </w:tr>
+    </w:tbl>
+    <w:p>
+      <w:pPr>
+        <w:spacing w:after="40"/>
+      </w:pPr>
+    </w:p>
+    <w:p>
+      <w:pPr>
+        <w:jc w:val="both"/>
+      </w:pPr>
+      <w:r>
+        <w:rPr>
+          <w:sz w:val="22"/>
+        </w:rPr>
+        <w:t>That sums to 74 to 127 against 64, so the cut order is decided now, not in November, and a lost week deletes from the bottom:</w:t>
+      </w:r>
+    </w:p>
+    <w:p>
+      <w:pPr>
+        <w:pStyle w:val="ListNumber"/>
+      </w:pPr>
+      <w:r>
+        <w:rPr>
+          <w:sz w:val="22"/>
+        </w:rPr>
+        <w:t>Protected: splitting, the store, the alias set, the GraphRAG-Bench arms</w:t>
+      </w:r>
+    </w:p>
+    <w:p>
+      <w:pPr>
+        <w:jc w:val="both"/>
+      </w:pPr>
+      <w:r>
+        <w:rPr>
+          <w:sz w:val="22"/>
+        </w:rPr>
+        <w:t>with their parity check, the resolution ablation, the instruments, the cost curves, the OCR control, the two wiki pages, and the paper.</w:t>
+      </w:r>
+    </w:p>
+    <w:p>
+      <w:pPr>
+        <w:pStyle w:val="ListNumber"/>
+      </w:pPr>
+      <w:r>
+        <w:rPr>
+          <w:sz w:val="22"/>
+        </w:rPr>
+        <w:t>First cut: the LongMemEval stretch item.</w:t>
+      </w:r>
+    </w:p>
+    <w:p>
+      <w:pPr>
+        <w:pStyle w:val="ListNumber"/>
+      </w:pPr>
+      <w:r>
+        <w:rPr>
+          <w:sz w:val="22"/>
+        </w:rPr>
+        <w:t>Then: the cells ablation.</w:t>
+      </w:r>
+    </w:p>
+    <w:p>
+      <w:pPr>
+        <w:pStyle w:val="ListNumber"/>
+      </w:pPr>
+      <w:r>
+        <w:rPr>
+          <w:sz w:val="22"/>
+        </w:rPr>
+        <w:t>Then: the wiki beyond its two showpiece pages.</w:t>
+      </w:r>
+    </w:p>
+    <w:p>
+      <w:pPr>
+        <w:pStyle w:val="ListNumber"/>
+      </w:pPr>
+      <w:r>
+        <w:rPr>
+          <w:sz w:val="22"/>
+        </w:rPr>
+        <w:t>Then: NarrativeQA.</w:t>
+      </w:r>
+    </w:p>
+    <w:p>
+      <w:pPr>
+        <w:pStyle w:val="ListNumber"/>
+      </w:pPr>
+      <w:r>
+        <w:rPr>
+          <w:sz w:val="22"/>
+        </w:rPr>
+        <w:t>Last cut before touching the protected core: the translation control. The</w:t>
+      </w:r>
+    </w:p>
+    <w:p>
+      <w:pPr>
+        <w:jc w:val="both"/>
+      </w:pPr>
+      <w:r>
+        <w:rPr>
+          <w:sz w:val="22"/>
+        </w:rPr>
+        <w:t>OCR control stays, because it is cheaper and carries the same argument.</w:t>
       </w:r>
     </w:p>
     <w:p>
@@ -1589,20 +2208,33 @@
         <w:rPr>
           <w:sz w:val="22"/>
         </w:rPr>
-        <w:t xml:space="preserve">Facts are append-only. When a predicate is functional, a later fact on the same subject and predicate supersedes an earlier one at read time; ruler_of collides that way, member_of never does, and the functional list is maintained by hand. What "later" means: </w:t>
+        <w:t xml:space="preserve">Facts are append-only. When a predicate is functional, a later fact on the same subject and predicate supersedes an earlier one at read time; ruler_of collides that way, member_of never does, and the functional list is maintained by hand. What "later" means: a fact's ordering time is its </w:t>
       </w:r>
       <w:r>
         <w:rPr>
           <w:rFonts w:ascii="Consolas" w:hAnsi="Consolas"/>
           <w:sz w:val="20"/>
         </w:rPr>
+        <w:t>valid_from</w:t>
+      </w:r>
+      <w:r>
+        <w:rPr>
+          <w:sz w:val="22"/>
+        </w:rPr>
+        <w:t xml:space="preserve"> when the text states one, else its document's </w:t>
+      </w:r>
+      <w:r>
+        <w:rPr>
+          <w:rFonts w:ascii="Consolas" w:hAnsi="Consolas"/>
+          <w:sz w:val="20"/>
+        </w:rPr>
         <w:t>occurred_at</w:t>
       </w:r>
       <w:r>
         <w:rPr>
           <w:sz w:val="22"/>
         </w:rPr>
-        <w:t xml:space="preserve"> when both facts have one, otherwise the pair of document order in the corpus manifest and unit position. Dates win where both sides have them; position carries everything else. Order by date alone and a novel corpus supersedes nothing, because almost no fact in a novel carries a date. Order by position alone and backfilling an old chat session silently reverses the truth.</w:t>
+        <w:t>, else null. Dated facts order by that time. Undated facts order among themselves by document order in the corpus manifest and unit position, and an undated fact never supersedes a dated one; that collision is flagged for review instead of resolved. Order by date alone and a novel corpus supersedes nothing, because almost no fact in a novel carries a date. Order by position alone and an undated upload ingested today would silently outrank a dated chat fact from two years ago, which is exactly the mixed corpus the spring product ingests.</w:t>
       </w:r>
     </w:p>
     <w:p>
@@ -3214,7 +3846,7 @@
               <w:rPr>
                 <w:sz w:val="18"/>
               </w:rPr>
-              <w:t>GraphRAG-Bench novels: full system, no-context control, flat retrieval, then the cells ablation</w:t>
+              <w:t>GraphRAG-Bench novels: full system, no-context control, flat retrieval, then the resolution ablation (co-occurrence and profile signals off, name matching alone)</w:t>
             </w:r>
           </w:p>
         </w:tc>
@@ -3246,7 +3878,7 @@
               <w:rPr>
                 <w:sz w:val="18"/>
               </w:rPr>
-              <w:t>the main paid run</w:t>
+              <w:t>the main paid run; the ablation is a replay, since per-signal candidate scores are logged at ingest</w:t>
             </w:r>
           </w:p>
         </w:tc>
@@ -3578,7 +4210,7 @@
         <w:rPr>
           <w:sz w:val="22"/>
         </w:rPr>
-        <w:t>GraphRAG-Bench carries the argument in its own baseline table: the cheapest system spends 879 tokens per question, the strongest graph system 1,008, and the most expensive 331,375, a 377-fold spread. Landing near the top of the accuracy column at the bottom of the cost column, with no graph database and no server, is the finding. Graph methods beat plain RAG on complex reasoning and summarization, not fact retrieval, so the cells ablation has a built-in target. At n=2,010 a 2.4-point difference is detectable and ablations typically move 2 to 5.</w:t>
+        <w:t>GraphRAG-Bench carries the argument in its own baseline table: the cheapest system spends 879 tokens per question, the strongest graph system 1,008, and the most expensive 331,375, a 377-fold spread. Landing near the top of the accuracy column at the bottom of the cost column, with no graph database and no server, is the finding. Those token figures come from their harness and their counting rules, so the same parity discipline applies as on LongMemEval: reproduce their plain-RAG baseline (58.76 on fact retrieval at 879 tokens) on our harness first. If it reproduces, our numbers join their table; if not, cost is reported as ratios between our own arms and their column is cited as context, never as comparison. Graph methods beat plain RAG on complex reasoning and summarization, not fact retrieval, so the cells ablation has a built-in target. At n=2,010 a 2.4-point difference is detectable and ablations typically move 2 to 5.</w:t>
       </w:r>
     </w:p>
     <w:p>
@@ -3635,7 +4267,7 @@
         <w:rPr>
           <w:sz w:val="22"/>
         </w:rPr>
-        <w:t>Rules that keep the numbers honest. The judge model never shares a tier with any writer and is calibrated on a hand-labeled sample before its scores count. Segmentation gets a deterministic baseline (TextTiling) beside the model call. Retrieval misses are classified coverage versus vocabulary before prescribing a fix. Agent-fleet evaluations carry completion accounting, since a partial fleet result looks confident. Report a pair metric and a cluster metric for resolution, because they can rank the same system differently.</w:t>
+        <w:t>Rules that keep the numbers honest. The judge model never shares a tier with any writer and is calibrated on a hand-labeled sample before its scores count. Any supersession score is reported beside its denominator: how many predicates the functional list holds, which they are, and what fraction of the questions scored actually touch one, because supersession fires only on that list and a reviewer will otherwise ask whether the result measures the system or the list. Segmentation gets a deterministic baseline (TextTiling) beside the model call. Retrieval misses are classified coverage versus vocabulary before prescribing a fix. Agent-fleet evaluations carry completion accounting, since a partial fleet result looks confident. Report a pair metric and a cluster metric for resolution, because they can rank the same system differently.</w:t>
       </w:r>
     </w:p>
     <w:p>
@@ -4134,7 +4766,7 @@
         <w:rPr>
           <w:sz w:val="22"/>
         </w:rPr>
-        <w:t>The cells ablation is committed. Whether a second one fits is open; of</w:t>
+        <w:t>The resolution ablation is committed, because it is the measurement the</w:t>
       </w:r>
     </w:p>
     <w:p>
@@ -4145,20 +4777,7 @@
         <w:rPr>
           <w:sz w:val="22"/>
         </w:rPr>
-        <w:t xml:space="preserve">the four remaining candidates (resolution, threshold, fact layer, refold), </w:t>
-      </w:r>
-      <w:r>
-        <w:rPr>
-          <w:rFonts w:ascii="Consolas" w:hAnsi="Consolas"/>
-          <w:sz w:val="20"/>
-        </w:rPr>
-        <w:t>docs/entity-resolution.md</w:t>
-      </w:r>
-      <w:r>
-        <w:rPr>
-          <w:sz w:val="22"/>
-        </w:rPr>
-        <w:t xml:space="preserve"> argues resolution should take the slot because it has published reference numbers and cells do not.</w:t>
+        <w:t>position claims and the replay design makes it cheap. Cells is next in line if hours appear, and GraphRAG-Bench's own graph-versus-RAG splits already sketch what it would show.</w:t>
       </w:r>
     </w:p>
     <w:p>

</xml_diff>